<commit_message>
v1.1.0: 0259-2026, partes una por línea, fecha por expediente, cédula física = domicilio, Actions y Releases
- Encabezado con varias partes en líneas separadas (el verificador rechaza «/»).
- Columna FECHA_EMISION por expediente en R1_DATOS.
- Las cédulas del expediente mandan sobre el directorio: cédula física → domicilio.
- fojas.py separa escritos de parte de documentos de Indecopi, fecha de
  presentación por firma de Mesa de Partes, vías del expediente, _hojas/ para escaneados.
- Workflow: simulación y verificador en cada push; Release en cada etiqueta v*.
- README (última actualización), CHANGELOG y refutaciones 20-24.

Co-Authored-By: Claude Opus 5.5 <noreply@anthropic.com>
Claude-Session: https://claude.ai/code/session_014QUd4VPDb7H3XTxZ25FgCr
</commit_message>
<xml_diff>
--- a/pruebas/0259/R1 0259-2026-CC1-APE.docx
+++ b/pruebas/0259/R1 0259-2026-CC1-APE.docx
@@ -305,7 +305,31 @@
                 <w:sz w:val="22"/>
                 <w:szCs w:val="22"/>
               </w:rPr>
-              <w:t xml:space="preserve">CHRISTIAN ERICK GARCÍA CHÁVEZ / DANIELA ALVARADO ARÉVALO</w:t>
+              <w:t xml:space="preserve">CHRISTIAN ERICK GARCÍA CHÁVEZ</w:t>
+            </w:r>
+          </w:p>
+          <w:p>
+            <w:pPr>
+              <w:tabs>
+                <w:tab w:val="left" w:pos="8222"/>
+              </w:tabs>
+              <w:rPr>
+                <w:rFonts w:ascii="Arial Narrow" w:hAnsi="Arial Narrow" w:cs="Arial"/>
+                <w:b/>
+                <w:noProof/>
+                <w:sz w:val="22"/>
+                <w:szCs w:val="22"/>
+              </w:rPr>
+            </w:pPr>
+            <w:r>
+              <w:rPr>
+                <w:b/>
+                <w:rFonts w:ascii="Arial Narrow" w:hAnsi="Arial Narrow" w:cs="Arial"/>
+                <w:noProof/>
+                <w:sz w:val="22"/>
+                <w:szCs w:val="22"/>
+              </w:rPr>
+              <w:t xml:space="preserve">DANIELA ALVARADO ARÉVALO</w:t>
             </w:r>
           </w:p>
         </w:tc>
@@ -534,7 +558,7 @@
           <w:sz w:val="22"/>
           <w:szCs w:val="22"/>
         </w:rPr>
-        <w:t xml:space="preserve">Lima, 24 de setiembre de 2026</w:t>
+        <w:t xml:space="preserve">Lima, 18 de setiembre de 2026</w:t>
       </w:r>
     </w:p>
     <w:p>
@@ -651,7 +675,46 @@
           <w:sz w:val="22"/>
           <w:szCs w:val="22"/>
         </w:rPr>
-        <w:t xml:space="preserve">Asimismo, requerir al señor Christian Erick García Chávez, a la señora Daniela Alvarado Arévalo y a Quálitas Compañía de Seguros S.A. para que, dentro del plazo de dos (2) días hábiles siguientes a la fecha en que reciban la notificación en sus bandejas de correo electrónico, efectúen la confirmación de recepción de la notificación remitida por este despacho a sus correos electrónicos, de conformidad con el segundo párrafo del numeral 4 del artículo 20 del Texto Único Ordenado de la Ley del Procedimiento Administrativo General, aprobado mediante Decreto Supremo N° 006-2026-JUS, bajo apercibimiento de rehacer el acto de notificación y notificarles conforme al numeral 1 del artículo 20 del citado cuerpo normativo.</w:t>
+        <w:t xml:space="preserve">Asimismo, requerir al señor Christian Erick García Chávez y a la señora Daniela Alvarado Arévalo para que, dentro del plazo de dos (2) días hábiles siguientes a la fecha en que reciban la notificación en sus bandejas de correo electrónico, efectúen la confirmación de recepción de la notificación remitida por este despacho a sus correos electrónicos, de conformidad con el segundo párrafo del numeral 4 del artículo 20 del Texto Único Ordenado de la Ley del Procedimiento Administrativo General, aprobado mediante Decreto Supremo N° 006-2026-JUS, bajo apercibimiento de rehacer el acto de notificación y notificarles conforme al numeral 1 del artículo 20 del citado cuerpo normativo.</w:t>
+      </w:r>
+    </w:p>
+    <w:p>
+      <w:pPr>
+        <w:pStyle w:val="Piedepgina"/>
+        <w:widowControl/>
+        <w:rPr>
+          <w:rFonts w:ascii="Arial Narrow" w:hAnsi="Arial Narrow" w:cs="Arial"/>
+          <w:sz w:val="22"/>
+          <w:szCs w:val="22"/>
+          <w:lang w:val="es-ES"/>
+        </w:rPr>
+      </w:pPr>
+      <w:r>
+        <w:rPr>
+          <w:rFonts w:ascii="Arial Narrow" w:hAnsi="Arial Narrow" w:cs="Arial"/>
+          <w:sz w:val="22"/>
+          <w:szCs w:val="22"/>
+          <w:lang w:val="es-ES"/>
+        </w:rPr>
+        <w:tab/>
+      </w:r>
+    </w:p>
+    <w:p>
+      <w:pPr>
+        <w:jc w:val="both"/>
+        <w:rPr>
+          <w:rFonts w:ascii="Arial Narrow" w:hAnsi="Arial Narrow" w:cs="Arial"/>
+          <w:sz w:val="22"/>
+          <w:szCs w:val="22"/>
+        </w:rPr>
+      </w:pPr>
+      <w:r>
+        <w:rPr>
+          <w:rFonts w:ascii="Arial Narrow" w:hAnsi="Arial Narrow" w:cs="Arial"/>
+          <w:sz w:val="22"/>
+          <w:szCs w:val="22"/>
+        </w:rPr>
+        <w:t xml:space="preserve">Finalmente, requerir a Quálitas Compañía de Seguros S.A. para que, dentro del plazo de dos (2) días hábiles siguientes a la fecha en que reciba la notificación en su domicilio procesal, señale un correo electrónico autorizando recibir las notificaciones correspondientes por dicho medio.</w:t>
       </w:r>
     </w:p>
     <w:p>

</xml_diff>